<commit_message>
feat: resizable columns in all tables, 3 service note types, FEO row height fix
- v-resizable-columns directive: always-visible handles (::before line), applied to all v-data-table views (CommercialRequests, SystemIncidents, Products, Organizations, Suppliers)
- Fix SubsidiesView FEO table: remove duplicate directive (was conflicting with composable), fix row height misalignment (display:flex moved from td to inner div)
- Add service_note_delivery and service_note_payment DOCX templates
- CreateOrderView: dropdown menu for 3 service note types (на организацию / на выдачу / на оплату)

Co-Authored-By: Claude Sonnet 4.6 <noreply@anthropic.com>
</commit_message>
<xml_diff>
--- a/backend/templates/service_note.docx
+++ b/backend/templates/service_note.docx
@@ -103,14 +103,6 @@
           <w:sz w:val="20"/>
         </w:rPr>
         <w:t>{{purchase_method}}</w:t>
-      </w:r>
-    </w:p>
-    <w:p>
-      <w:pPr>
-        <w:spacing w:after="40"/>
-      </w:pPr>
-      <w:r>
-        <w:t xml:space="preserve">Основание закупки: {{purchase_basis}}</w:t>
       </w:r>
     </w:p>
     <w:p>
@@ -237,7 +229,7 @@
         <w:rPr>
           <w:sz w:val="20"/>
         </w:rPr>
-        <w:t>Инициатор: {{ initiator_role }}  {{ initiator_name }}</w:t>
+        <w:t>Исполнитель: _______________  /  ФИО  /  {{today}}</w:t>
       </w:r>
     </w:p>
     <w:sectPr>

</xml_diff>

<commit_message>
fix(phase26-v): legend в шаблоне СЗ без literal {{}} и {%%}
Пользователь снова получил «Проверьте парные теги в Word: {% if %} ↔ {% endif %}»
на свежесгенерированном шаблоне service_note_advance.docx.

Причина: в строке LEGEND_LINES для пояснений было «{{синие переменные}}»
и «серые {% маркеры %}». docxtpl при рендере интерпретирует ВСЕ literal {%%} в
тексте шаблона как настоящие jinja-теги — даже внутри объяснений. Не находя
парного {% endX %} для «{% маркеры %}», валит ошибку парных тегов.

Фикс: заменены literal {{}}/{%%} на «угловые кавычки» — «синие переменные»
и «серые маркеры». Документация остаётся читаемой, парсер docxtpl больше
не пытается выполнить эти строки.

Перегенерированы все 5 шаблонов через `py make_service_notes.py`.
Проверка: service_note_advance.docx — if=1/endif=1, for=2/endfor=2, нет
unknown tags.

Co-Authored-By: Claude Opus 4.7 (1M context) <noreply@anthropic.com>
</commit_message>
<xml_diff>
--- a/backend/templates/service_note.docx
+++ b/backend/templates/service_note.docx
@@ -30,7 +30,7 @@
           <w:color w:val="1E40AF"/>
           <w:sz w:val="20"/>
         </w:rPr>
-        <w:t>{{синие переменные}}    — автоподстановка из БД</w:t>
+        <w:t>«синие переменные»    — автоподстановка из БД</w:t>
       </w:r>
     </w:p>
     <w:p>
@@ -45,7 +45,7 @@
           <w:color w:val="15803D"/>
           <w:sz w:val="20"/>
         </w:rPr>
-        <w:t>зелёный текст           — вариант 1 в условном блоке</w:t>
+        <w:t>зелёный текст         — вариант 1 в условном блоке</w:t>
       </w:r>
     </w:p>
     <w:p>
@@ -60,7 +60,7 @@
           <w:color w:val="C2410C"/>
           <w:sz w:val="20"/>
         </w:rPr>
-        <w:t>оранжевый текст         — вариант 2</w:t>
+        <w:t>оранжевый текст       — вариант 2</w:t>
       </w:r>
     </w:p>
     <w:p>
@@ -76,7 +76,7 @@
           <w:color w:val="6B7280"/>
           <w:sz w:val="20"/>
         </w:rPr>
-        <w:t>серые {% маркеры %}    — технические условия Jinja2 (не трогать)</w:t>
+        <w:t>серые «маркеры»       — технические условия Jinja2 (не трогать)</w:t>
       </w:r>
     </w:p>
     <w:p>

</xml_diff>